<commit_message>
Add SBI legal-case uploads and stabilize report layout
</commit_message>
<xml_diff>
--- a/MCAROC.Portal/MCAROC_Analysis/ReportTemplates/SBI/sbi-template.docx
+++ b/MCAROC.Portal/MCAROC_Analysis/ReportTemplates/SBI/sbi-template.docx
@@ -1649,10 +1649,10 @@
         <w:tblW w:w="10440" w:type="dxa"/>
         <w:tblInd w:w="0" w:type="dxa"/>
         <w:tblBorders>
-          <w:top w:val="single" w:sz="6" w:color="000000"/>
-          <w:left w:val="single" w:sz="6" w:color="000000"/>
-          <w:bottom w:val="single" w:sz="6" w:color="000000"/>
-          <w:right w:val="single" w:sz="6" w:color="000000"/>
+          <w:top w:val="single" w:color="000000" w:sz="6"/>
+          <w:left w:val="single" w:color="000000" w:sz="6"/>
+          <w:bottom w:val="single" w:color="000000" w:sz="6"/>
+          <w:right w:val="single" w:color="000000" w:sz="6"/>
           <w:insideH w:val="nil"/>
           <w:insideV w:val="nil"/>
         </w:tblBorders>
@@ -2996,546 +2996,587 @@
     </w:p>
     <w:tbl>
       <w:tblPr>
-        <w:tblW w:w="0" w:type="auto"/>
-        <w:tblCellMar>
-          <w:left w:w="0" w:type="dxa"/>
-          <w:right w:w="0" w:type="dxa"/>
-        </w:tblCellMar>
-        <w:tblLook w:val="0000" w:firstRow="0" w:lastRow="0" w:firstColumn="0" w:lastColumn="0" w:noHBand="0" w:noVBand="0"/>
+        <w:tblW w:w="10148" w:type="dxa"/>
+        <w:tblLook w:val="0000" w:firstRow="false" w:lastRow="false" w:firstColumn="false" w:lastColumn="false" w:noHBand="false" w:noVBand="false"/>
       </w:tblPr>
       <w:tblGrid>
-        <w:gridCol w:w="9834"/>
-        <w:gridCol w:w="630"/>
+        <w:gridCol w:w="5074"/>
+        <w:gridCol w:w="5074"/>
       </w:tblGrid>
       <w:tr>
-        <w:trPr>
-          <w:trHeight w:val="260"/>
-        </w:trPr>
-        <w:tc>
-          <w:tcPr>
-            <w:tcW w:w="9834" w:type="dxa"/>
+        <w:tc>
+          <w:tcPr>
+            <w:tcW w:w="5074" w:type="dxa"/>
+            <w:tcBorders>
+              <w:top w:val="single" w:color="BFBFBF" w:sz="4"/>
+              <w:bottom w:val="single" w:color="BFBFBF" w:sz="4"/>
+              <w:left w:val="single" w:color="BFBFBF" w:sz="4"/>
+              <w:right w:val="single" w:color="BFBFBF" w:sz="4"/>
+            </w:tcBorders>
             <w:tcMar>
-              <w:top w:w="40" w:type="dxa"/>
-              <w:left w:w="40" w:type="dxa"/>
-              <w:bottom w:w="40" w:type="dxa"/>
-              <w:right w:w="40" w:type="dxa"/>
+              <w:top w:w="60" w:type="dxa"/>
+              <w:bottom w:w="60" w:type="dxa"/>
+              <w:start w:w="100" w:type="dxa"/>
+              <w:end w:w="100" w:type="dxa"/>
             </w:tcMar>
           </w:tcPr>
           <w:p>
             <w:pPr>
-              <w:spacing w:after="0" w:line="240" w:lineRule="auto"/>
-              <w:rPr>
-                <w:rFonts w:asciiTheme="majorHAnsi" w:hAnsiTheme="majorHAnsi" w:cstheme="majorHAnsi"/>
-                <w:sz w:val="20"/>
-                <w:szCs w:val="20"/>
-              </w:rPr>
-            </w:pPr>
-            <w:r>
-              <w:rPr>
-                <w:rFonts w:asciiTheme="majorHAnsi" w:hAnsiTheme="majorHAnsi" w:cstheme="majorHAnsi"/>
-                <w:sz w:val="20"/>
-                <w:szCs w:val="20"/>
-              </w:rPr>
-              <w:t>No records found</w:t>
-            </w:r>
-          </w:p>
-        </w:tc>
-        <w:tc>
-          <w:tcPr>
-            <w:tcW w:w="630" w:type="dxa"/>
+              <w:spacing w:after="0"/>
+            </w:pPr>
+            <w:r>
+              <w:rPr>
+                <w:rFonts w:asciiTheme="majorHAnsi" w:hAnsiTheme="majorHAnsi" w:cstheme="majorHAnsi"/>
+                <w:b/>
+                <w:sz w:val="18"/>
+                <w:szCs w:val="18"/>
+              </w:rPr>
+              <w:t>Sr. No : </w:t>
+            </w:r>
+            <w:r>
+              <w:rPr>
+                <w:rFonts w:asciiTheme="majorHAnsi" w:hAnsiTheme="majorHAnsi" w:cstheme="majorHAnsi"/>
+                <w:sz w:val="18"/>
+                <w:szCs w:val="18"/>
+              </w:rPr>
+              <w:t xml:space="preserve">-</w:t>
+            </w:r>
+          </w:p>
+        </w:tc>
+        <w:tc>
+          <w:tcPr>
+            <w:tcW w:w="5074" w:type="dxa"/>
+            <w:tcBorders>
+              <w:top w:val="single" w:color="BFBFBF" w:sz="4"/>
+              <w:bottom w:val="single" w:color="BFBFBF" w:sz="4"/>
+              <w:left w:val="single" w:color="BFBFBF" w:sz="4"/>
+              <w:right w:val="single" w:color="BFBFBF" w:sz="4"/>
+            </w:tcBorders>
             <w:tcMar>
-              <w:top w:w="40" w:type="dxa"/>
-              <w:left w:w="40" w:type="dxa"/>
-              <w:bottom w:w="40" w:type="dxa"/>
-              <w:right w:w="40" w:type="dxa"/>
+              <w:top w:w="60" w:type="dxa"/>
+              <w:bottom w:w="60" w:type="dxa"/>
+              <w:start w:w="100" w:type="dxa"/>
+              <w:end w:w="100" w:type="dxa"/>
             </w:tcMar>
           </w:tcPr>
           <w:p>
             <w:pPr>
-              <w:spacing w:after="0" w:line="240" w:lineRule="auto"/>
-              <w:rPr>
-                <w:rFonts w:asciiTheme="majorHAnsi" w:hAnsiTheme="majorHAnsi" w:cstheme="majorHAnsi"/>
-                <w:sz w:val="20"/>
-                <w:szCs w:val="20"/>
-              </w:rPr>
-            </w:pPr>
+              <w:spacing w:after="0"/>
+            </w:pPr>
+            <w:r>
+              <w:rPr>
+                <w:rFonts w:asciiTheme="majorHAnsi" w:hAnsiTheme="majorHAnsi" w:cstheme="majorHAnsi"/>
+                <w:b/>
+                <w:sz w:val="18"/>
+                <w:szCs w:val="18"/>
+              </w:rPr>
+              <w:t>Court : </w:t>
+            </w:r>
+            <w:r>
+              <w:rPr>
+                <w:rFonts w:asciiTheme="majorHAnsi" w:hAnsiTheme="majorHAnsi" w:cstheme="majorHAnsi"/>
+                <w:sz w:val="18"/>
+                <w:szCs w:val="18"/>
+              </w:rPr>
+              <w:t xml:space="preserve">-</w:t>
+            </w:r>
+          </w:p>
+        </w:tc>
+      </w:tr>
+      <w:tr>
+        <w:tc>
+          <w:tcPr>
+            <w:tcW w:w="5074" w:type="dxa"/>
+            <w:tcBorders>
+              <w:top w:val="single" w:color="BFBFBF" w:sz="4"/>
+              <w:bottom w:val="single" w:color="BFBFBF" w:sz="4"/>
+              <w:left w:val="single" w:color="BFBFBF" w:sz="4"/>
+              <w:right w:val="single" w:color="BFBFBF" w:sz="4"/>
+            </w:tcBorders>
+            <w:tcMar>
+              <w:top w:w="60" w:type="dxa"/>
+              <w:bottom w:w="60" w:type="dxa"/>
+              <w:start w:w="100" w:type="dxa"/>
+              <w:end w:w="100" w:type="dxa"/>
+            </w:tcMar>
+          </w:tcPr>
+          <w:p>
+            <w:pPr>
+              <w:spacing w:after="0"/>
+            </w:pPr>
+            <w:r>
+              <w:rPr>
+                <w:rFonts w:asciiTheme="majorHAnsi" w:hAnsiTheme="majorHAnsi" w:cstheme="majorHAnsi"/>
+                <w:b/>
+                <w:sz w:val="18"/>
+                <w:szCs w:val="18"/>
+              </w:rPr>
+              <w:t>Case No : </w:t>
+            </w:r>
+            <w:r>
+              <w:rPr>
+                <w:rFonts w:asciiTheme="majorHAnsi" w:hAnsiTheme="majorHAnsi" w:cstheme="majorHAnsi"/>
+                <w:sz w:val="18"/>
+                <w:szCs w:val="18"/>
+              </w:rPr>
+              <w:t xml:space="preserve">-</w:t>
+            </w:r>
+          </w:p>
+        </w:tc>
+        <w:tc>
+          <w:tcPr>
+            <w:tcW w:w="5074" w:type="dxa"/>
+            <w:tcBorders>
+              <w:top w:val="single" w:color="BFBFBF" w:sz="4"/>
+              <w:bottom w:val="single" w:color="BFBFBF" w:sz="4"/>
+              <w:left w:val="single" w:color="BFBFBF" w:sz="4"/>
+              <w:right w:val="single" w:color="BFBFBF" w:sz="4"/>
+            </w:tcBorders>
+            <w:tcMar>
+              <w:top w:w="60" w:type="dxa"/>
+              <w:bottom w:w="60" w:type="dxa"/>
+              <w:start w:w="100" w:type="dxa"/>
+              <w:end w:w="100" w:type="dxa"/>
+            </w:tcMar>
+          </w:tcPr>
+          <w:p>
+            <w:pPr>
+              <w:spacing w:after="0"/>
+            </w:pPr>
+            <w:r>
+              <w:rPr>
+                <w:rFonts w:asciiTheme="majorHAnsi" w:hAnsiTheme="majorHAnsi" w:cstheme="majorHAnsi"/>
+                <w:b/>
+                <w:sz w:val="18"/>
+                <w:szCs w:val="18"/>
+              </w:rPr>
+              <w:t>Case Type : </w:t>
+            </w:r>
+            <w:r>
+              <w:rPr>
+                <w:rFonts w:asciiTheme="majorHAnsi" w:hAnsiTheme="majorHAnsi" w:cstheme="majorHAnsi"/>
+                <w:sz w:val="18"/>
+                <w:szCs w:val="18"/>
+              </w:rPr>
+              <w:t xml:space="preserve">-</w:t>
+            </w:r>
+          </w:p>
+        </w:tc>
+      </w:tr>
+      <w:tr>
+        <w:tc>
+          <w:tcPr>
+            <w:tcW w:w="5074" w:type="dxa"/>
+            <w:tcBorders>
+              <w:top w:val="single" w:color="BFBFBF" w:sz="4"/>
+              <w:bottom w:val="single" w:color="BFBFBF" w:sz="4"/>
+              <w:left w:val="single" w:color="BFBFBF" w:sz="4"/>
+              <w:right w:val="single" w:color="BFBFBF" w:sz="4"/>
+            </w:tcBorders>
+            <w:tcMar>
+              <w:top w:w="60" w:type="dxa"/>
+              <w:bottom w:w="60" w:type="dxa"/>
+              <w:start w:w="100" w:type="dxa"/>
+              <w:end w:w="100" w:type="dxa"/>
+            </w:tcMar>
+          </w:tcPr>
+          <w:p>
+            <w:pPr>
+              <w:spacing w:after="0"/>
+            </w:pPr>
+            <w:r>
+              <w:rPr>
+                <w:rFonts w:asciiTheme="majorHAnsi" w:hAnsiTheme="majorHAnsi" w:cstheme="majorHAnsi"/>
+                <w:b/>
+                <w:sz w:val="18"/>
+                <w:szCs w:val="18"/>
+              </w:rPr>
+              <w:t>Case Year : </w:t>
+            </w:r>
+            <w:r>
+              <w:rPr>
+                <w:rFonts w:asciiTheme="majorHAnsi" w:hAnsiTheme="majorHAnsi" w:cstheme="majorHAnsi"/>
+                <w:sz w:val="18"/>
+                <w:szCs w:val="18"/>
+              </w:rPr>
+              <w:t xml:space="preserve">-</w:t>
+            </w:r>
+          </w:p>
+        </w:tc>
+        <w:tc>
+          <w:tcPr>
+            <w:tcW w:w="5074" w:type="dxa"/>
+            <w:tcBorders>
+              <w:top w:val="single" w:color="BFBFBF" w:sz="4"/>
+              <w:bottom w:val="single" w:color="BFBFBF" w:sz="4"/>
+              <w:left w:val="single" w:color="BFBFBF" w:sz="4"/>
+              <w:right w:val="single" w:color="BFBFBF" w:sz="4"/>
+            </w:tcBorders>
+            <w:tcMar>
+              <w:top w:w="60" w:type="dxa"/>
+              <w:bottom w:w="60" w:type="dxa"/>
+              <w:start w:w="100" w:type="dxa"/>
+              <w:end w:w="100" w:type="dxa"/>
+            </w:tcMar>
+          </w:tcPr>
+          <w:p>
+            <w:pPr>
+              <w:spacing w:after="0"/>
+            </w:pPr>
+            <w:r>
+              <w:rPr>
+                <w:rFonts w:asciiTheme="majorHAnsi" w:hAnsiTheme="majorHAnsi" w:cstheme="majorHAnsi"/>
+                <w:b/>
+                <w:sz w:val="18"/>
+                <w:szCs w:val="18"/>
+              </w:rPr>
+              <w:t>Act : </w:t>
+            </w:r>
+            <w:r>
+              <w:rPr>
+                <w:rFonts w:asciiTheme="majorHAnsi" w:hAnsiTheme="majorHAnsi" w:cstheme="majorHAnsi"/>
+                <w:sz w:val="18"/>
+                <w:szCs w:val="18"/>
+              </w:rPr>
+              <w:t xml:space="preserve">-</w:t>
+            </w:r>
+          </w:p>
+        </w:tc>
+      </w:tr>
+      <w:tr>
+        <w:tc>
+          <w:tcPr>
+            <w:tcW w:w="5074" w:type="dxa"/>
+            <w:tcBorders>
+              <w:top w:val="single" w:color="BFBFBF" w:sz="4"/>
+              <w:bottom w:val="single" w:color="BFBFBF" w:sz="4"/>
+              <w:left w:val="single" w:color="BFBFBF" w:sz="4"/>
+              <w:right w:val="single" w:color="BFBFBF" w:sz="4"/>
+            </w:tcBorders>
+            <w:tcMar>
+              <w:top w:w="60" w:type="dxa"/>
+              <w:bottom w:w="60" w:type="dxa"/>
+              <w:start w:w="100" w:type="dxa"/>
+              <w:end w:w="100" w:type="dxa"/>
+            </w:tcMar>
+          </w:tcPr>
+          <w:p>
+            <w:pPr>
+              <w:spacing w:after="0"/>
+            </w:pPr>
+            <w:r>
+              <w:rPr>
+                <w:rFonts w:asciiTheme="majorHAnsi" w:hAnsiTheme="majorHAnsi" w:cstheme="majorHAnsi"/>
+                <w:b/>
+                <w:sz w:val="18"/>
+                <w:szCs w:val="18"/>
+              </w:rPr>
+              <w:t>Date of Filing : </w:t>
+            </w:r>
+            <w:r>
+              <w:rPr>
+                <w:rFonts w:asciiTheme="majorHAnsi" w:hAnsiTheme="majorHAnsi" w:cstheme="majorHAnsi"/>
+                <w:sz w:val="18"/>
+                <w:szCs w:val="18"/>
+              </w:rPr>
+              <w:t xml:space="preserve">-</w:t>
+            </w:r>
+          </w:p>
+        </w:tc>
+        <w:tc>
+          <w:tcPr>
+            <w:tcW w:w="5074" w:type="dxa"/>
+            <w:tcBorders>
+              <w:top w:val="single" w:color="BFBFBF" w:sz="4"/>
+              <w:bottom w:val="single" w:color="BFBFBF" w:sz="4"/>
+              <w:left w:val="single" w:color="BFBFBF" w:sz="4"/>
+              <w:right w:val="single" w:color="BFBFBF" w:sz="4"/>
+            </w:tcBorders>
+            <w:tcMar>
+              <w:top w:w="60" w:type="dxa"/>
+              <w:bottom w:w="60" w:type="dxa"/>
+              <w:start w:w="100" w:type="dxa"/>
+              <w:end w:w="100" w:type="dxa"/>
+            </w:tcMar>
+          </w:tcPr>
+          <w:p>
+            <w:pPr>
+              <w:spacing w:after="0"/>
+            </w:pPr>
+            <w:r>
+              <w:rPr>
+                <w:rFonts w:asciiTheme="majorHAnsi" w:hAnsiTheme="majorHAnsi" w:cstheme="majorHAnsi"/>
+                <w:b/>
+                <w:sz w:val="18"/>
+                <w:szCs w:val="18"/>
+              </w:rPr>
+              <w:t>Case Stage : </w:t>
+            </w:r>
+            <w:r>
+              <w:rPr>
+                <w:rFonts w:asciiTheme="majorHAnsi" w:hAnsiTheme="majorHAnsi" w:cstheme="majorHAnsi"/>
+                <w:sz w:val="18"/>
+                <w:szCs w:val="18"/>
+              </w:rPr>
+              <w:t xml:space="preserve">-</w:t>
+            </w:r>
+          </w:p>
+        </w:tc>
+      </w:tr>
+      <w:tr>
+        <w:tc>
+          <w:tcPr>
+            <w:tcW w:w="5074" w:type="dxa"/>
+            <w:tcBorders>
+              <w:top w:val="single" w:color="BFBFBF" w:sz="4"/>
+              <w:bottom w:val="single" w:color="BFBFBF" w:sz="4"/>
+              <w:left w:val="single" w:color="BFBFBF" w:sz="4"/>
+              <w:right w:val="single" w:color="BFBFBF" w:sz="4"/>
+            </w:tcBorders>
+            <w:tcMar>
+              <w:top w:w="60" w:type="dxa"/>
+              <w:bottom w:w="60" w:type="dxa"/>
+              <w:start w:w="100" w:type="dxa"/>
+              <w:end w:w="100" w:type="dxa"/>
+            </w:tcMar>
+          </w:tcPr>
+          <w:p>
+            <w:pPr>
+              <w:spacing w:after="0"/>
+            </w:pPr>
+            <w:r>
+              <w:rPr>
+                <w:rFonts w:asciiTheme="majorHAnsi" w:hAnsiTheme="majorHAnsi" w:cstheme="majorHAnsi"/>
+                <w:b/>
+                <w:sz w:val="18"/>
+                <w:szCs w:val="18"/>
+              </w:rPr>
+              <w:t>State : </w:t>
+            </w:r>
+            <w:r>
+              <w:rPr>
+                <w:rFonts w:asciiTheme="majorHAnsi" w:hAnsiTheme="majorHAnsi" w:cstheme="majorHAnsi"/>
+                <w:sz w:val="18"/>
+                <w:szCs w:val="18"/>
+              </w:rPr>
+              <w:t xml:space="preserve">-</w:t>
+            </w:r>
+          </w:p>
+        </w:tc>
+        <w:tc>
+          <w:tcPr>
+            <w:tcW w:w="5074" w:type="dxa"/>
+            <w:tcBorders>
+              <w:top w:val="single" w:color="BFBFBF" w:sz="4"/>
+              <w:bottom w:val="single" w:color="BFBFBF" w:sz="4"/>
+              <w:left w:val="single" w:color="BFBFBF" w:sz="4"/>
+              <w:right w:val="single" w:color="BFBFBF" w:sz="4"/>
+            </w:tcBorders>
+            <w:tcMar>
+              <w:top w:w="60" w:type="dxa"/>
+              <w:bottom w:w="60" w:type="dxa"/>
+              <w:start w:w="100" w:type="dxa"/>
+              <w:end w:w="100" w:type="dxa"/>
+            </w:tcMar>
+          </w:tcPr>
+          <w:p>
+            <w:pPr>
+              <w:spacing w:after="0"/>
+            </w:pPr>
+            <w:r>
+              <w:rPr>
+                <w:rFonts w:asciiTheme="majorHAnsi" w:hAnsiTheme="majorHAnsi" w:cstheme="majorHAnsi"/>
+                <w:b/>
+                <w:sz w:val="18"/>
+                <w:szCs w:val="18"/>
+              </w:rPr>
+              <w:t>District : </w:t>
+            </w:r>
+            <w:r>
+              <w:rPr>
+                <w:rFonts w:asciiTheme="majorHAnsi" w:hAnsiTheme="majorHAnsi" w:cstheme="majorHAnsi"/>
+                <w:sz w:val="18"/>
+                <w:szCs w:val="18"/>
+              </w:rPr>
+              <w:t xml:space="preserve">-</w:t>
+            </w:r>
+          </w:p>
+        </w:tc>
+      </w:tr>
+      <w:tr>
+        <w:tc>
+          <w:tcPr>
+            <w:tcW w:w="10148" w:type="dxa"/>
+            <w:tcBorders>
+              <w:top w:val="single" w:color="BFBFBF" w:sz="4"/>
+              <w:bottom w:val="single" w:color="BFBFBF" w:sz="4"/>
+              <w:left w:val="single" w:color="BFBFBF" w:sz="4"/>
+              <w:right w:val="single" w:color="BFBFBF" w:sz="4"/>
+            </w:tcBorders>
+            <w:tcMar>
+              <w:top w:w="60" w:type="dxa"/>
+              <w:bottom w:w="60" w:type="dxa"/>
+              <w:start w:w="100" w:type="dxa"/>
+              <w:end w:w="100" w:type="dxa"/>
+            </w:tcMar>
+            <w:gridSpan w:val="2"/>
+          </w:tcPr>
+          <w:p>
+            <w:pPr>
+              <w:spacing w:after="0"/>
+            </w:pPr>
+            <w:r>
+              <w:rPr>
+                <w:rFonts w:asciiTheme="majorHAnsi" w:hAnsiTheme="majorHAnsi" w:cstheme="majorHAnsi"/>
+                <w:b/>
+                <w:sz w:val="18"/>
+                <w:szCs w:val="18"/>
+              </w:rPr>
+              <w:t>Case Details : </w:t>
+            </w:r>
+            <w:r>
+              <w:rPr>
+                <w:rFonts w:asciiTheme="majorHAnsi" w:hAnsiTheme="majorHAnsi" w:cstheme="majorHAnsi"/>
+                <w:sz w:val="18"/>
+                <w:szCs w:val="18"/>
+              </w:rPr>
+              <w:t xml:space="preserve">No litigation cases on file.</w:t>
+            </w:r>
+          </w:p>
+        </w:tc>
+      </w:tr>
+      <w:tr>
+        <w:tc>
+          <w:tcPr>
+            <w:tcW w:w="5074" w:type="dxa"/>
+            <w:tcBorders>
+              <w:top w:val="single" w:color="BFBFBF" w:sz="4"/>
+              <w:bottom w:val="single" w:color="BFBFBF" w:sz="4"/>
+              <w:left w:val="single" w:color="BFBFBF" w:sz="4"/>
+              <w:right w:val="single" w:color="BFBFBF" w:sz="4"/>
+            </w:tcBorders>
+            <w:tcMar>
+              <w:top w:w="60" w:type="dxa"/>
+              <w:bottom w:w="60" w:type="dxa"/>
+              <w:start w:w="100" w:type="dxa"/>
+              <w:end w:w="100" w:type="dxa"/>
+            </w:tcMar>
+          </w:tcPr>
+          <w:p>
+            <w:pPr>
+              <w:spacing w:after="0"/>
+            </w:pPr>
+            <w:r>
+              <w:rPr>
+                <w:rFonts w:asciiTheme="majorHAnsi" w:hAnsiTheme="majorHAnsi" w:cstheme="majorHAnsi"/>
+                <w:b/>
+                <w:sz w:val="18"/>
+                <w:szCs w:val="18"/>
+              </w:rPr>
+              <w:t>LDOH : </w:t>
+            </w:r>
+            <w:r>
+              <w:rPr>
+                <w:rFonts w:asciiTheme="majorHAnsi" w:hAnsiTheme="majorHAnsi" w:cstheme="majorHAnsi"/>
+                <w:sz w:val="18"/>
+                <w:szCs w:val="18"/>
+              </w:rPr>
+              <w:t xml:space="preserve">-</w:t>
+            </w:r>
+          </w:p>
+        </w:tc>
+        <w:tc>
+          <w:tcPr>
+            <w:tcW w:w="5074" w:type="dxa"/>
+            <w:tcBorders>
+              <w:top w:val="single" w:color="BFBFBF" w:sz="4"/>
+              <w:bottom w:val="single" w:color="BFBFBF" w:sz="4"/>
+              <w:left w:val="single" w:color="BFBFBF" w:sz="4"/>
+              <w:right w:val="single" w:color="BFBFBF" w:sz="4"/>
+            </w:tcBorders>
+            <w:tcMar>
+              <w:top w:w="60" w:type="dxa"/>
+              <w:bottom w:w="60" w:type="dxa"/>
+              <w:start w:w="100" w:type="dxa"/>
+              <w:end w:w="100" w:type="dxa"/>
+            </w:tcMar>
+          </w:tcPr>
+          <w:p>
+            <w:pPr>
+              <w:spacing w:after="0"/>
+            </w:pPr>
+            <w:r>
+              <w:rPr>
+                <w:rFonts w:asciiTheme="majorHAnsi" w:hAnsiTheme="majorHAnsi" w:cstheme="majorHAnsi"/>
+                <w:b/>
+                <w:sz w:val="18"/>
+                <w:szCs w:val="18"/>
+              </w:rPr>
+              <w:t>NDOH : </w:t>
+            </w:r>
+            <w:r>
+              <w:rPr>
+                <w:rFonts w:asciiTheme="majorHAnsi" w:hAnsiTheme="majorHAnsi" w:cstheme="majorHAnsi"/>
+                <w:sz w:val="18"/>
+                <w:szCs w:val="18"/>
+              </w:rPr>
+              <w:t xml:space="preserve">-</w:t>
+            </w:r>
+          </w:p>
+        </w:tc>
+      </w:tr>
+      <w:tr>
+        <w:tc>
+          <w:tcPr>
+            <w:tcW w:w="10148" w:type="dxa"/>
+            <w:tcBorders>
+              <w:top w:val="single" w:color="BFBFBF" w:sz="4"/>
+              <w:bottom w:val="single" w:color="BFBFBF" w:sz="4"/>
+              <w:left w:val="single" w:color="BFBFBF" w:sz="4"/>
+              <w:right w:val="single" w:color="BFBFBF" w:sz="4"/>
+            </w:tcBorders>
+            <w:tcMar>
+              <w:top w:w="60" w:type="dxa"/>
+              <w:bottom w:w="60" w:type="dxa"/>
+              <w:start w:w="100" w:type="dxa"/>
+              <w:end w:w="100" w:type="dxa"/>
+            </w:tcMar>
+            <w:gridSpan w:val="2"/>
+          </w:tcPr>
+          <w:p>
+            <w:pPr>
+              <w:spacing w:after="0"/>
+            </w:pPr>
+            <w:r>
+              <w:rPr>
+                <w:rFonts w:asciiTheme="majorHAnsi" w:hAnsiTheme="majorHAnsi" w:cstheme="majorHAnsi"/>
+                <w:b/>
+                <w:sz w:val="18"/>
+                <w:szCs w:val="18"/>
+              </w:rPr>
+              <w:t>Status : </w:t>
+            </w:r>
+            <w:r>
+              <w:rPr>
+                <w:rFonts w:asciiTheme="majorHAnsi" w:hAnsiTheme="majorHAnsi" w:cstheme="majorHAnsi"/>
+                <w:sz w:val="18"/>
+                <w:szCs w:val="18"/>
+              </w:rPr>
+              <w:t xml:space="preserve">-</w:t>
+            </w:r>
           </w:p>
         </w:tc>
       </w:tr>
       <w:tr>
         <w:trPr>
-          <w:trHeight w:val="260"/>
+          <w:trHeight w:val="120"/>
         </w:trPr>
         <w:tc>
           <w:tcPr>
-            <w:tcW w:w="9834" w:type="dxa"/>
-            <w:tcMar>
-              <w:top w:w="40" w:type="dxa"/>
-              <w:left w:w="40" w:type="dxa"/>
-              <w:bottom w:w="40" w:type="dxa"/>
-              <w:right w:w="40" w:type="dxa"/>
-            </w:tcMar>
-          </w:tcPr>
-          <w:p>
-            <w:pPr>
-              <w:spacing w:after="0" w:line="240" w:lineRule="auto"/>
-              <w:rPr>
-                <w:rFonts w:asciiTheme="majorHAnsi" w:hAnsiTheme="majorHAnsi" w:cstheme="majorHAnsi"/>
-                <w:sz w:val="20"/>
-                <w:szCs w:val="20"/>
-              </w:rPr>
-            </w:pPr>
-          </w:p>
-        </w:tc>
-        <w:tc>
-          <w:tcPr>
-            <w:tcW w:w="630" w:type="dxa"/>
-            <w:tcMar>
-              <w:top w:w="40" w:type="dxa"/>
-              <w:left w:w="40" w:type="dxa"/>
-              <w:bottom w:w="40" w:type="dxa"/>
-              <w:right w:w="40" w:type="dxa"/>
-            </w:tcMar>
-          </w:tcPr>
-          <w:p>
-            <w:pPr>
-              <w:spacing w:after="0" w:line="240" w:lineRule="auto"/>
-              <w:rPr>
-                <w:rFonts w:asciiTheme="majorHAnsi" w:hAnsiTheme="majorHAnsi" w:cstheme="majorHAnsi"/>
-                <w:sz w:val="20"/>
-                <w:szCs w:val="20"/>
-              </w:rPr>
-            </w:pPr>
-          </w:p>
-        </w:tc>
-      </w:tr>
-      <w:tr>
-        <w:trPr>
-          <w:trHeight w:val="260"/>
-        </w:trPr>
-        <w:tc>
-          <w:tcPr>
-            <w:tcW w:w="9834" w:type="dxa"/>
-            <w:tcMar>
-              <w:top w:w="40" w:type="dxa"/>
-              <w:left w:w="40" w:type="dxa"/>
-              <w:bottom w:w="40" w:type="dxa"/>
-              <w:right w:w="40" w:type="dxa"/>
-            </w:tcMar>
-          </w:tcPr>
-          <w:p>
-            <w:pPr>
-              <w:spacing w:after="0" w:line="240" w:lineRule="auto"/>
-              <w:rPr>
-                <w:rFonts w:asciiTheme="majorHAnsi" w:hAnsiTheme="majorHAnsi" w:cstheme="majorHAnsi"/>
-                <w:sz w:val="20"/>
-                <w:szCs w:val="20"/>
-              </w:rPr>
-            </w:pPr>
-          </w:p>
-        </w:tc>
-        <w:tc>
-          <w:tcPr>
-            <w:tcW w:w="630" w:type="dxa"/>
-            <w:tcMar>
-              <w:top w:w="40" w:type="dxa"/>
-              <w:left w:w="40" w:type="dxa"/>
-              <w:bottom w:w="40" w:type="dxa"/>
-              <w:right w:w="40" w:type="dxa"/>
-            </w:tcMar>
-          </w:tcPr>
-          <w:p>
-            <w:pPr>
-              <w:spacing w:after="0" w:line="240" w:lineRule="auto"/>
-              <w:rPr>
-                <w:rFonts w:asciiTheme="majorHAnsi" w:hAnsiTheme="majorHAnsi" w:cstheme="majorHAnsi"/>
-                <w:sz w:val="20"/>
-                <w:szCs w:val="20"/>
-              </w:rPr>
-            </w:pPr>
-          </w:p>
-        </w:tc>
-      </w:tr>
-      <w:tr>
-        <w:trPr>
-          <w:trHeight w:val="260"/>
-        </w:trPr>
-        <w:tc>
-          <w:tcPr>
-            <w:tcW w:w="9834" w:type="dxa"/>
-            <w:tcMar>
-              <w:top w:w="40" w:type="dxa"/>
-              <w:left w:w="40" w:type="dxa"/>
-              <w:bottom w:w="40" w:type="dxa"/>
-              <w:right w:w="40" w:type="dxa"/>
-            </w:tcMar>
-          </w:tcPr>
-          <w:p>
-            <w:pPr>
-              <w:spacing w:after="0" w:line="240" w:lineRule="auto"/>
-              <w:rPr>
-                <w:rFonts w:asciiTheme="majorHAnsi" w:hAnsiTheme="majorHAnsi" w:cstheme="majorHAnsi"/>
-                <w:sz w:val="20"/>
-                <w:szCs w:val="20"/>
-              </w:rPr>
-            </w:pPr>
-          </w:p>
-        </w:tc>
-        <w:tc>
-          <w:tcPr>
-            <w:tcW w:w="630" w:type="dxa"/>
-            <w:tcMar>
-              <w:top w:w="40" w:type="dxa"/>
-              <w:left w:w="40" w:type="dxa"/>
-              <w:bottom w:w="40" w:type="dxa"/>
-              <w:right w:w="40" w:type="dxa"/>
-            </w:tcMar>
-          </w:tcPr>
-          <w:p>
-            <w:pPr>
-              <w:spacing w:after="0" w:line="240" w:lineRule="auto"/>
-              <w:rPr>
-                <w:rFonts w:asciiTheme="majorHAnsi" w:hAnsiTheme="majorHAnsi" w:cstheme="majorHAnsi"/>
-                <w:sz w:val="20"/>
-                <w:szCs w:val="20"/>
-              </w:rPr>
-            </w:pPr>
-          </w:p>
-        </w:tc>
-      </w:tr>
-      <w:tr>
-        <w:trPr>
-          <w:trHeight w:val="260"/>
-        </w:trPr>
-        <w:tc>
-          <w:tcPr>
-            <w:tcW w:w="9834" w:type="dxa"/>
-            <w:tcMar>
-              <w:top w:w="40" w:type="dxa"/>
-              <w:left w:w="40" w:type="dxa"/>
-              <w:bottom w:w="40" w:type="dxa"/>
-              <w:right w:w="40" w:type="dxa"/>
-            </w:tcMar>
-          </w:tcPr>
-          <w:p>
-            <w:pPr>
-              <w:spacing w:after="0" w:line="240" w:lineRule="auto"/>
-              <w:rPr>
-                <w:rFonts w:asciiTheme="majorHAnsi" w:hAnsiTheme="majorHAnsi" w:cstheme="majorHAnsi"/>
-                <w:sz w:val="20"/>
-                <w:szCs w:val="20"/>
-              </w:rPr>
-            </w:pPr>
-          </w:p>
-        </w:tc>
-        <w:tc>
-          <w:tcPr>
-            <w:tcW w:w="630" w:type="dxa"/>
-            <w:tcMar>
-              <w:top w:w="40" w:type="dxa"/>
-              <w:left w:w="40" w:type="dxa"/>
-              <w:bottom w:w="40" w:type="dxa"/>
-              <w:right w:w="40" w:type="dxa"/>
-            </w:tcMar>
-          </w:tcPr>
-          <w:p>
-            <w:pPr>
-              <w:spacing w:after="0" w:line="240" w:lineRule="auto"/>
-              <w:rPr>
-                <w:rFonts w:asciiTheme="majorHAnsi" w:hAnsiTheme="majorHAnsi" w:cstheme="majorHAnsi"/>
-                <w:sz w:val="20"/>
-                <w:szCs w:val="20"/>
-              </w:rPr>
-            </w:pPr>
-          </w:p>
-        </w:tc>
-      </w:tr>
-      <w:tr>
-        <w:trPr>
-          <w:trHeight w:val="260"/>
-        </w:trPr>
-        <w:tc>
-          <w:tcPr>
-            <w:tcW w:w="9834" w:type="dxa"/>
-            <w:tcMar>
-              <w:top w:w="40" w:type="dxa"/>
-              <w:left w:w="40" w:type="dxa"/>
-              <w:bottom w:w="40" w:type="dxa"/>
-              <w:right w:w="40" w:type="dxa"/>
-            </w:tcMar>
-          </w:tcPr>
-          <w:p>
-            <w:pPr>
-              <w:spacing w:after="0" w:line="240" w:lineRule="auto"/>
-              <w:rPr>
-                <w:rFonts w:asciiTheme="majorHAnsi" w:hAnsiTheme="majorHAnsi" w:cstheme="majorHAnsi"/>
-                <w:sz w:val="20"/>
-                <w:szCs w:val="20"/>
-              </w:rPr>
-            </w:pPr>
-          </w:p>
-        </w:tc>
-        <w:tc>
-          <w:tcPr>
-            <w:tcW w:w="630" w:type="dxa"/>
-            <w:tcMar>
-              <w:top w:w="40" w:type="dxa"/>
-              <w:left w:w="40" w:type="dxa"/>
-              <w:bottom w:w="40" w:type="dxa"/>
-              <w:right w:w="40" w:type="dxa"/>
-            </w:tcMar>
-          </w:tcPr>
-          <w:p>
-            <w:pPr>
-              <w:spacing w:after="0" w:line="240" w:lineRule="auto"/>
-              <w:rPr>
-                <w:rFonts w:asciiTheme="majorHAnsi" w:hAnsiTheme="majorHAnsi" w:cstheme="majorHAnsi"/>
-                <w:sz w:val="20"/>
-                <w:szCs w:val="20"/>
-              </w:rPr>
-            </w:pPr>
-          </w:p>
-        </w:tc>
-      </w:tr>
-      <w:tr>
-        <w:trPr>
-          <w:trHeight w:val="260"/>
-        </w:trPr>
-        <w:tc>
-          <w:tcPr>
-            <w:tcW w:w="9834" w:type="dxa"/>
-            <w:tcMar>
-              <w:top w:w="40" w:type="dxa"/>
-              <w:left w:w="40" w:type="dxa"/>
-              <w:bottom w:w="40" w:type="dxa"/>
-              <w:right w:w="40" w:type="dxa"/>
-            </w:tcMar>
-          </w:tcPr>
-          <w:p>
-            <w:pPr>
-              <w:spacing w:after="0" w:line="240" w:lineRule="auto"/>
-              <w:rPr>
-                <w:rFonts w:asciiTheme="majorHAnsi" w:hAnsiTheme="majorHAnsi" w:cstheme="majorHAnsi"/>
-                <w:sz w:val="20"/>
-                <w:szCs w:val="20"/>
-              </w:rPr>
-            </w:pPr>
-          </w:p>
-        </w:tc>
-        <w:tc>
-          <w:tcPr>
-            <w:tcW w:w="630" w:type="dxa"/>
-            <w:tcMar>
-              <w:top w:w="40" w:type="dxa"/>
-              <w:left w:w="40" w:type="dxa"/>
-              <w:bottom w:w="40" w:type="dxa"/>
-              <w:right w:w="40" w:type="dxa"/>
-            </w:tcMar>
-          </w:tcPr>
-          <w:p>
-            <w:pPr>
-              <w:spacing w:after="0" w:line="240" w:lineRule="auto"/>
-              <w:rPr>
-                <w:rFonts w:asciiTheme="majorHAnsi" w:hAnsiTheme="majorHAnsi" w:cstheme="majorHAnsi"/>
-                <w:sz w:val="20"/>
-                <w:szCs w:val="20"/>
-              </w:rPr>
-            </w:pPr>
-          </w:p>
-        </w:tc>
-      </w:tr>
-      <w:tr>
-        <w:trPr>
-          <w:trHeight w:val="260"/>
-        </w:trPr>
-        <w:tc>
-          <w:tcPr>
-            <w:tcW w:w="9834" w:type="dxa"/>
-            <w:tcMar>
-              <w:top w:w="40" w:type="dxa"/>
-              <w:left w:w="40" w:type="dxa"/>
-              <w:bottom w:w="40" w:type="dxa"/>
-              <w:right w:w="40" w:type="dxa"/>
-            </w:tcMar>
-          </w:tcPr>
-          <w:p>
-            <w:pPr>
-              <w:spacing w:after="0" w:line="240" w:lineRule="auto"/>
-              <w:rPr>
-                <w:rFonts w:asciiTheme="majorHAnsi" w:hAnsiTheme="majorHAnsi" w:cstheme="majorHAnsi"/>
-                <w:sz w:val="20"/>
-                <w:szCs w:val="20"/>
-              </w:rPr>
-            </w:pPr>
-          </w:p>
-        </w:tc>
-        <w:tc>
-          <w:tcPr>
-            <w:tcW w:w="630" w:type="dxa"/>
-            <w:tcMar>
-              <w:top w:w="40" w:type="dxa"/>
-              <w:left w:w="40" w:type="dxa"/>
-              <w:bottom w:w="40" w:type="dxa"/>
-              <w:right w:w="40" w:type="dxa"/>
-            </w:tcMar>
-          </w:tcPr>
-          <w:p>
-            <w:pPr>
-              <w:spacing w:after="0" w:line="240" w:lineRule="auto"/>
-              <w:rPr>
-                <w:rFonts w:asciiTheme="majorHAnsi" w:hAnsiTheme="majorHAnsi" w:cstheme="majorHAnsi"/>
-                <w:sz w:val="20"/>
-                <w:szCs w:val="20"/>
-              </w:rPr>
-            </w:pPr>
-          </w:p>
-        </w:tc>
-      </w:tr>
-      <w:tr>
-        <w:trPr>
-          <w:trHeight w:val="260"/>
-        </w:trPr>
-        <w:tc>
-          <w:tcPr>
-            <w:tcW w:w="9834" w:type="dxa"/>
-            <w:tcMar>
-              <w:top w:w="40" w:type="dxa"/>
-              <w:left w:w="40" w:type="dxa"/>
-              <w:bottom w:w="40" w:type="dxa"/>
-              <w:right w:w="40" w:type="dxa"/>
-            </w:tcMar>
-          </w:tcPr>
-          <w:p>
-            <w:pPr>
-              <w:spacing w:after="0" w:line="240" w:lineRule="auto"/>
-              <w:rPr>
-                <w:rFonts w:asciiTheme="majorHAnsi" w:hAnsiTheme="majorHAnsi" w:cstheme="majorHAnsi"/>
-                <w:sz w:val="20"/>
-                <w:szCs w:val="20"/>
-              </w:rPr>
-            </w:pPr>
-          </w:p>
-        </w:tc>
-        <w:tc>
-          <w:tcPr>
-            <w:tcW w:w="630" w:type="dxa"/>
-            <w:tcMar>
-              <w:top w:w="40" w:type="dxa"/>
-              <w:left w:w="40" w:type="dxa"/>
-              <w:bottom w:w="40" w:type="dxa"/>
-              <w:right w:w="40" w:type="dxa"/>
-            </w:tcMar>
-          </w:tcPr>
-          <w:p>
-            <w:pPr>
-              <w:spacing w:after="0" w:line="240" w:lineRule="auto"/>
-              <w:rPr>
-                <w:rFonts w:asciiTheme="majorHAnsi" w:hAnsiTheme="majorHAnsi" w:cstheme="majorHAnsi"/>
-                <w:sz w:val="20"/>
-                <w:szCs w:val="20"/>
-              </w:rPr>
-            </w:pPr>
-          </w:p>
-        </w:tc>
-      </w:tr>
-      <w:tr>
-        <w:trPr>
-          <w:trHeight w:val="260"/>
-        </w:trPr>
-        <w:tc>
-          <w:tcPr>
-            <w:tcW w:w="9834" w:type="dxa"/>
-            <w:tcMar>
-              <w:top w:w="40" w:type="dxa"/>
-              <w:left w:w="40" w:type="dxa"/>
-              <w:bottom w:w="40" w:type="dxa"/>
-              <w:right w:w="40" w:type="dxa"/>
-            </w:tcMar>
-          </w:tcPr>
-          <w:p>
-            <w:pPr>
-              <w:spacing w:after="0" w:line="240" w:lineRule="auto"/>
-              <w:rPr>
-                <w:rFonts w:asciiTheme="majorHAnsi" w:hAnsiTheme="majorHAnsi" w:cstheme="majorHAnsi"/>
-                <w:sz w:val="20"/>
-                <w:szCs w:val="20"/>
-              </w:rPr>
-            </w:pPr>
-          </w:p>
-        </w:tc>
-        <w:tc>
-          <w:tcPr>
-            <w:tcW w:w="630" w:type="dxa"/>
-            <w:tcMar>
-              <w:top w:w="40" w:type="dxa"/>
-              <w:left w:w="40" w:type="dxa"/>
-              <w:bottom w:w="40" w:type="dxa"/>
-              <w:right w:w="40" w:type="dxa"/>
-            </w:tcMar>
-          </w:tcPr>
-          <w:p>
-            <w:pPr>
-              <w:spacing w:after="0" w:line="240" w:lineRule="auto"/>
-              <w:rPr>
-                <w:rFonts w:asciiTheme="majorHAnsi" w:hAnsiTheme="majorHAnsi" w:cstheme="majorHAnsi"/>
-                <w:sz w:val="20"/>
-                <w:szCs w:val="20"/>
-              </w:rPr>
-            </w:pPr>
-          </w:p>
-        </w:tc>
-      </w:tr>
-      <w:tr>
-        <w:trPr>
-          <w:trHeight w:val="308"/>
-        </w:trPr>
-        <w:tc>
-          <w:tcPr>
-            <w:tcW w:w="9834" w:type="dxa"/>
-            <w:tcBorders>
-              <w:bottom w:val="single" w:color="000000" w:sz="8" w:space="0"/>
-            </w:tcBorders>
-            <w:tcMar>
-              <w:top w:w="40" w:type="dxa"/>
-              <w:left w:w="40" w:type="dxa"/>
-              <w:bottom w:w="40" w:type="dxa"/>
-              <w:right w:w="40" w:type="dxa"/>
-            </w:tcMar>
-          </w:tcPr>
-          <w:p>
-            <w:pPr>
-              <w:spacing w:after="0" w:line="240" w:lineRule="auto"/>
-              <w:rPr>
-                <w:rFonts w:asciiTheme="majorHAnsi" w:hAnsiTheme="majorHAnsi" w:cstheme="majorHAnsi"/>
-                <w:sz w:val="20"/>
-                <w:szCs w:val="20"/>
-              </w:rPr>
-            </w:pPr>
-          </w:p>
-        </w:tc>
-        <w:tc>
-          <w:tcPr>
-            <w:tcW w:w="630" w:type="dxa"/>
-            <w:tcBorders>
-              <w:bottom w:val="single" w:color="000000" w:sz="8" w:space="0"/>
-            </w:tcBorders>
-            <w:tcMar>
-              <w:top w:w="40" w:type="dxa"/>
-              <w:left w:w="40" w:type="dxa"/>
-              <w:bottom w:w="40" w:type="dxa"/>
-              <w:right w:w="40" w:type="dxa"/>
-            </w:tcMar>
-          </w:tcPr>
-          <w:p>
-            <w:pPr>
-              <w:spacing w:after="0" w:line="240" w:lineRule="auto"/>
-              <w:rPr>
-                <w:rFonts w:asciiTheme="majorHAnsi" w:hAnsiTheme="majorHAnsi" w:cstheme="majorHAnsi"/>
-                <w:sz w:val="20"/>
-                <w:szCs w:val="20"/>
-              </w:rPr>
-            </w:pPr>
-          </w:p>
+            <w:tcW w:w="10148" w:type="dxa"/>
+            <w:gridSpan w:val="2"/>
+          </w:tcPr>
+          <w:p/>
         </w:tc>
       </w:tr>
     </w:tbl>
@@ -4499,7 +4540,8 @@
     </w:p>
     <w:p>
       <w:pPr>
-        <w:spacing w:after="64"/>
+        <w:pageBreakBefore/>
+        <w:spacing w:before="600" w:after="64"/>
         <w:rPr>
           <w:rFonts w:ascii="Verdana" w:hAnsi="Verdana"/>
           <w:b/>
@@ -4775,8 +4817,8 @@
                 <wp:positionH relativeFrom="column">
                   <wp:posOffset>158115</wp:posOffset>
                 </wp:positionH>
-                <wp:positionV relativeFrom="paragraph">
-                  <wp:posOffset>6221095</wp:posOffset>
+                <wp:positionV relativeFrom="page">
+                  <wp:posOffset>5850000</wp:posOffset>
                 </wp:positionV>
                 <wp:extent cx="3150235" cy="1257300"/>
                 <wp:effectExtent l="0" t="0" r="0" b="0"/>
@@ -4883,7 +4925,7 @@
                 <v:stroke joinstyle="miter"/>
                 <v:path gradientshapeok="t" o:connecttype="rect"/>
               </v:shapetype>
-              <v:shape id="Text Box 2" style="position:absolute;left:0;text-align:left;margin-left:12.45pt;margin-top:489.85pt;width:248.05pt;height:99pt;z-index:251662336;visibility:visible;mso-wrap-style:square;mso-width-percent:0;mso-height-percent:0;mso-wrap-distance-left:9pt;mso-wrap-distance-top:3.6pt;mso-wrap-distance-right:9pt;mso-wrap-distance-bottom:3.6pt;mso-position-horizontal:absolute;mso-position-horizontal-relative:text;mso-position-vertical:absolute;mso-position-vertical-relative:text;mso-width-percent:0;mso-height-percent:0;mso-width-relative:margin;mso-height-relative:margin;v-text-anchor:top" o:spid="_x0000_s1026" stroked="f" type="#_x0000_t202" o:gfxdata="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">
+              <v:shape id="Text Box 2" style="position:absolute;left:0;text-align:left;margin-left:12.45pt;margin-top:460.63pt;width:248.05pt;height:99pt;z-index:251662336;visibility:visible;mso-wrap-style:square;mso-width-percent:0;mso-height-percent:0;mso-wrap-distance-left:9pt;mso-wrap-distance-top:3.6pt;mso-wrap-distance-right:9pt;mso-wrap-distance-bottom:3.6pt;mso-position-horizontal:absolute;mso-position-horizontal-relative:text;mso-position-vertical:absolute;mso-position-vertical-relative:page;mso-width-percent:0;mso-height-percent:0;mso-width-relative:margin;mso-height-relative:margin;v-text-anchor:top" o:spid="_x0000_s1026" stroked="f" type="#_x0000_t202" o:gfxdata="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">
                 <v:textbox>
                   <w:txbxContent>
                     <w:p>

</xml_diff>

<commit_message>
Add SBI legal-case uploads and stabilize report layout (#219)
</commit_message>
<xml_diff>
--- a/MCAROC.Portal/MCAROC_Analysis/ReportTemplates/SBI/sbi-template.docx
+++ b/MCAROC.Portal/MCAROC_Analysis/ReportTemplates/SBI/sbi-template.docx
@@ -1649,10 +1649,10 @@
         <w:tblW w:w="10440" w:type="dxa"/>
         <w:tblInd w:w="0" w:type="dxa"/>
         <w:tblBorders>
-          <w:top w:val="single" w:sz="6" w:color="000000"/>
-          <w:left w:val="single" w:sz="6" w:color="000000"/>
-          <w:bottom w:val="single" w:sz="6" w:color="000000"/>
-          <w:right w:val="single" w:sz="6" w:color="000000"/>
+          <w:top w:val="single" w:color="000000" w:sz="6"/>
+          <w:left w:val="single" w:color="000000" w:sz="6"/>
+          <w:bottom w:val="single" w:color="000000" w:sz="6"/>
+          <w:right w:val="single" w:color="000000" w:sz="6"/>
           <w:insideH w:val="nil"/>
           <w:insideV w:val="nil"/>
         </w:tblBorders>
@@ -2996,546 +2996,587 @@
     </w:p>
     <w:tbl>
       <w:tblPr>
-        <w:tblW w:w="0" w:type="auto"/>
-        <w:tblCellMar>
-          <w:left w:w="0" w:type="dxa"/>
-          <w:right w:w="0" w:type="dxa"/>
-        </w:tblCellMar>
-        <w:tblLook w:val="0000" w:firstRow="0" w:lastRow="0" w:firstColumn="0" w:lastColumn="0" w:noHBand="0" w:noVBand="0"/>
+        <w:tblW w:w="10148" w:type="dxa"/>
+        <w:tblLook w:val="0000" w:firstRow="false" w:lastRow="false" w:firstColumn="false" w:lastColumn="false" w:noHBand="false" w:noVBand="false"/>
       </w:tblPr>
       <w:tblGrid>
-        <w:gridCol w:w="9834"/>
-        <w:gridCol w:w="630"/>
+        <w:gridCol w:w="5074"/>
+        <w:gridCol w:w="5074"/>
       </w:tblGrid>
       <w:tr>
-        <w:trPr>
-          <w:trHeight w:val="260"/>
-        </w:trPr>
-        <w:tc>
-          <w:tcPr>
-            <w:tcW w:w="9834" w:type="dxa"/>
+        <w:tc>
+          <w:tcPr>
+            <w:tcW w:w="5074" w:type="dxa"/>
+            <w:tcBorders>
+              <w:top w:val="single" w:color="BFBFBF" w:sz="4"/>
+              <w:bottom w:val="single" w:color="BFBFBF" w:sz="4"/>
+              <w:left w:val="single" w:color="BFBFBF" w:sz="4"/>
+              <w:right w:val="single" w:color="BFBFBF" w:sz="4"/>
+            </w:tcBorders>
             <w:tcMar>
-              <w:top w:w="40" w:type="dxa"/>
-              <w:left w:w="40" w:type="dxa"/>
-              <w:bottom w:w="40" w:type="dxa"/>
-              <w:right w:w="40" w:type="dxa"/>
+              <w:top w:w="60" w:type="dxa"/>
+              <w:bottom w:w="60" w:type="dxa"/>
+              <w:start w:w="100" w:type="dxa"/>
+              <w:end w:w="100" w:type="dxa"/>
             </w:tcMar>
           </w:tcPr>
           <w:p>
             <w:pPr>
-              <w:spacing w:after="0" w:line="240" w:lineRule="auto"/>
-              <w:rPr>
-                <w:rFonts w:asciiTheme="majorHAnsi" w:hAnsiTheme="majorHAnsi" w:cstheme="majorHAnsi"/>
-                <w:sz w:val="20"/>
-                <w:szCs w:val="20"/>
-              </w:rPr>
-            </w:pPr>
-            <w:r>
-              <w:rPr>
-                <w:rFonts w:asciiTheme="majorHAnsi" w:hAnsiTheme="majorHAnsi" w:cstheme="majorHAnsi"/>
-                <w:sz w:val="20"/>
-                <w:szCs w:val="20"/>
-              </w:rPr>
-              <w:t>No records found</w:t>
-            </w:r>
-          </w:p>
-        </w:tc>
-        <w:tc>
-          <w:tcPr>
-            <w:tcW w:w="630" w:type="dxa"/>
+              <w:spacing w:after="0"/>
+            </w:pPr>
+            <w:r>
+              <w:rPr>
+                <w:rFonts w:asciiTheme="majorHAnsi" w:hAnsiTheme="majorHAnsi" w:cstheme="majorHAnsi"/>
+                <w:b/>
+                <w:sz w:val="18"/>
+                <w:szCs w:val="18"/>
+              </w:rPr>
+              <w:t>Sr. No : </w:t>
+            </w:r>
+            <w:r>
+              <w:rPr>
+                <w:rFonts w:asciiTheme="majorHAnsi" w:hAnsiTheme="majorHAnsi" w:cstheme="majorHAnsi"/>
+                <w:sz w:val="18"/>
+                <w:szCs w:val="18"/>
+              </w:rPr>
+              <w:t xml:space="preserve">-</w:t>
+            </w:r>
+          </w:p>
+        </w:tc>
+        <w:tc>
+          <w:tcPr>
+            <w:tcW w:w="5074" w:type="dxa"/>
+            <w:tcBorders>
+              <w:top w:val="single" w:color="BFBFBF" w:sz="4"/>
+              <w:bottom w:val="single" w:color="BFBFBF" w:sz="4"/>
+              <w:left w:val="single" w:color="BFBFBF" w:sz="4"/>
+              <w:right w:val="single" w:color="BFBFBF" w:sz="4"/>
+            </w:tcBorders>
             <w:tcMar>
-              <w:top w:w="40" w:type="dxa"/>
-              <w:left w:w="40" w:type="dxa"/>
-              <w:bottom w:w="40" w:type="dxa"/>
-              <w:right w:w="40" w:type="dxa"/>
+              <w:top w:w="60" w:type="dxa"/>
+              <w:bottom w:w="60" w:type="dxa"/>
+              <w:start w:w="100" w:type="dxa"/>
+              <w:end w:w="100" w:type="dxa"/>
             </w:tcMar>
           </w:tcPr>
           <w:p>
             <w:pPr>
-              <w:spacing w:after="0" w:line="240" w:lineRule="auto"/>
-              <w:rPr>
-                <w:rFonts w:asciiTheme="majorHAnsi" w:hAnsiTheme="majorHAnsi" w:cstheme="majorHAnsi"/>
-                <w:sz w:val="20"/>
-                <w:szCs w:val="20"/>
-              </w:rPr>
-            </w:pPr>
+              <w:spacing w:after="0"/>
+            </w:pPr>
+            <w:r>
+              <w:rPr>
+                <w:rFonts w:asciiTheme="majorHAnsi" w:hAnsiTheme="majorHAnsi" w:cstheme="majorHAnsi"/>
+                <w:b/>
+                <w:sz w:val="18"/>
+                <w:szCs w:val="18"/>
+              </w:rPr>
+              <w:t>Court : </w:t>
+            </w:r>
+            <w:r>
+              <w:rPr>
+                <w:rFonts w:asciiTheme="majorHAnsi" w:hAnsiTheme="majorHAnsi" w:cstheme="majorHAnsi"/>
+                <w:sz w:val="18"/>
+                <w:szCs w:val="18"/>
+              </w:rPr>
+              <w:t xml:space="preserve">-</w:t>
+            </w:r>
+          </w:p>
+        </w:tc>
+      </w:tr>
+      <w:tr>
+        <w:tc>
+          <w:tcPr>
+            <w:tcW w:w="5074" w:type="dxa"/>
+            <w:tcBorders>
+              <w:top w:val="single" w:color="BFBFBF" w:sz="4"/>
+              <w:bottom w:val="single" w:color="BFBFBF" w:sz="4"/>
+              <w:left w:val="single" w:color="BFBFBF" w:sz="4"/>
+              <w:right w:val="single" w:color="BFBFBF" w:sz="4"/>
+            </w:tcBorders>
+            <w:tcMar>
+              <w:top w:w="60" w:type="dxa"/>
+              <w:bottom w:w="60" w:type="dxa"/>
+              <w:start w:w="100" w:type="dxa"/>
+              <w:end w:w="100" w:type="dxa"/>
+            </w:tcMar>
+          </w:tcPr>
+          <w:p>
+            <w:pPr>
+              <w:spacing w:after="0"/>
+            </w:pPr>
+            <w:r>
+              <w:rPr>
+                <w:rFonts w:asciiTheme="majorHAnsi" w:hAnsiTheme="majorHAnsi" w:cstheme="majorHAnsi"/>
+                <w:b/>
+                <w:sz w:val="18"/>
+                <w:szCs w:val="18"/>
+              </w:rPr>
+              <w:t>Case No : </w:t>
+            </w:r>
+            <w:r>
+              <w:rPr>
+                <w:rFonts w:asciiTheme="majorHAnsi" w:hAnsiTheme="majorHAnsi" w:cstheme="majorHAnsi"/>
+                <w:sz w:val="18"/>
+                <w:szCs w:val="18"/>
+              </w:rPr>
+              <w:t xml:space="preserve">-</w:t>
+            </w:r>
+          </w:p>
+        </w:tc>
+        <w:tc>
+          <w:tcPr>
+            <w:tcW w:w="5074" w:type="dxa"/>
+            <w:tcBorders>
+              <w:top w:val="single" w:color="BFBFBF" w:sz="4"/>
+              <w:bottom w:val="single" w:color="BFBFBF" w:sz="4"/>
+              <w:left w:val="single" w:color="BFBFBF" w:sz="4"/>
+              <w:right w:val="single" w:color="BFBFBF" w:sz="4"/>
+            </w:tcBorders>
+            <w:tcMar>
+              <w:top w:w="60" w:type="dxa"/>
+              <w:bottom w:w="60" w:type="dxa"/>
+              <w:start w:w="100" w:type="dxa"/>
+              <w:end w:w="100" w:type="dxa"/>
+            </w:tcMar>
+          </w:tcPr>
+          <w:p>
+            <w:pPr>
+              <w:spacing w:after="0"/>
+            </w:pPr>
+            <w:r>
+              <w:rPr>
+                <w:rFonts w:asciiTheme="majorHAnsi" w:hAnsiTheme="majorHAnsi" w:cstheme="majorHAnsi"/>
+                <w:b/>
+                <w:sz w:val="18"/>
+                <w:szCs w:val="18"/>
+              </w:rPr>
+              <w:t>Case Type : </w:t>
+            </w:r>
+            <w:r>
+              <w:rPr>
+                <w:rFonts w:asciiTheme="majorHAnsi" w:hAnsiTheme="majorHAnsi" w:cstheme="majorHAnsi"/>
+                <w:sz w:val="18"/>
+                <w:szCs w:val="18"/>
+              </w:rPr>
+              <w:t xml:space="preserve">-</w:t>
+            </w:r>
+          </w:p>
+        </w:tc>
+      </w:tr>
+      <w:tr>
+        <w:tc>
+          <w:tcPr>
+            <w:tcW w:w="5074" w:type="dxa"/>
+            <w:tcBorders>
+              <w:top w:val="single" w:color="BFBFBF" w:sz="4"/>
+              <w:bottom w:val="single" w:color="BFBFBF" w:sz="4"/>
+              <w:left w:val="single" w:color="BFBFBF" w:sz="4"/>
+              <w:right w:val="single" w:color="BFBFBF" w:sz="4"/>
+            </w:tcBorders>
+            <w:tcMar>
+              <w:top w:w="60" w:type="dxa"/>
+              <w:bottom w:w="60" w:type="dxa"/>
+              <w:start w:w="100" w:type="dxa"/>
+              <w:end w:w="100" w:type="dxa"/>
+            </w:tcMar>
+          </w:tcPr>
+          <w:p>
+            <w:pPr>
+              <w:spacing w:after="0"/>
+            </w:pPr>
+            <w:r>
+              <w:rPr>
+                <w:rFonts w:asciiTheme="majorHAnsi" w:hAnsiTheme="majorHAnsi" w:cstheme="majorHAnsi"/>
+                <w:b/>
+                <w:sz w:val="18"/>
+                <w:szCs w:val="18"/>
+              </w:rPr>
+              <w:t>Case Year : </w:t>
+            </w:r>
+            <w:r>
+              <w:rPr>
+                <w:rFonts w:asciiTheme="majorHAnsi" w:hAnsiTheme="majorHAnsi" w:cstheme="majorHAnsi"/>
+                <w:sz w:val="18"/>
+                <w:szCs w:val="18"/>
+              </w:rPr>
+              <w:t xml:space="preserve">-</w:t>
+            </w:r>
+          </w:p>
+        </w:tc>
+        <w:tc>
+          <w:tcPr>
+            <w:tcW w:w="5074" w:type="dxa"/>
+            <w:tcBorders>
+              <w:top w:val="single" w:color="BFBFBF" w:sz="4"/>
+              <w:bottom w:val="single" w:color="BFBFBF" w:sz="4"/>
+              <w:left w:val="single" w:color="BFBFBF" w:sz="4"/>
+              <w:right w:val="single" w:color="BFBFBF" w:sz="4"/>
+            </w:tcBorders>
+            <w:tcMar>
+              <w:top w:w="60" w:type="dxa"/>
+              <w:bottom w:w="60" w:type="dxa"/>
+              <w:start w:w="100" w:type="dxa"/>
+              <w:end w:w="100" w:type="dxa"/>
+            </w:tcMar>
+          </w:tcPr>
+          <w:p>
+            <w:pPr>
+              <w:spacing w:after="0"/>
+            </w:pPr>
+            <w:r>
+              <w:rPr>
+                <w:rFonts w:asciiTheme="majorHAnsi" w:hAnsiTheme="majorHAnsi" w:cstheme="majorHAnsi"/>
+                <w:b/>
+                <w:sz w:val="18"/>
+                <w:szCs w:val="18"/>
+              </w:rPr>
+              <w:t>Act : </w:t>
+            </w:r>
+            <w:r>
+              <w:rPr>
+                <w:rFonts w:asciiTheme="majorHAnsi" w:hAnsiTheme="majorHAnsi" w:cstheme="majorHAnsi"/>
+                <w:sz w:val="18"/>
+                <w:szCs w:val="18"/>
+              </w:rPr>
+              <w:t xml:space="preserve">-</w:t>
+            </w:r>
+          </w:p>
+        </w:tc>
+      </w:tr>
+      <w:tr>
+        <w:tc>
+          <w:tcPr>
+            <w:tcW w:w="5074" w:type="dxa"/>
+            <w:tcBorders>
+              <w:top w:val="single" w:color="BFBFBF" w:sz="4"/>
+              <w:bottom w:val="single" w:color="BFBFBF" w:sz="4"/>
+              <w:left w:val="single" w:color="BFBFBF" w:sz="4"/>
+              <w:right w:val="single" w:color="BFBFBF" w:sz="4"/>
+            </w:tcBorders>
+            <w:tcMar>
+              <w:top w:w="60" w:type="dxa"/>
+              <w:bottom w:w="60" w:type="dxa"/>
+              <w:start w:w="100" w:type="dxa"/>
+              <w:end w:w="100" w:type="dxa"/>
+            </w:tcMar>
+          </w:tcPr>
+          <w:p>
+            <w:pPr>
+              <w:spacing w:after="0"/>
+            </w:pPr>
+            <w:r>
+              <w:rPr>
+                <w:rFonts w:asciiTheme="majorHAnsi" w:hAnsiTheme="majorHAnsi" w:cstheme="majorHAnsi"/>
+                <w:b/>
+                <w:sz w:val="18"/>
+                <w:szCs w:val="18"/>
+              </w:rPr>
+              <w:t>Date of Filing : </w:t>
+            </w:r>
+            <w:r>
+              <w:rPr>
+                <w:rFonts w:asciiTheme="majorHAnsi" w:hAnsiTheme="majorHAnsi" w:cstheme="majorHAnsi"/>
+                <w:sz w:val="18"/>
+                <w:szCs w:val="18"/>
+              </w:rPr>
+              <w:t xml:space="preserve">-</w:t>
+            </w:r>
+          </w:p>
+        </w:tc>
+        <w:tc>
+          <w:tcPr>
+            <w:tcW w:w="5074" w:type="dxa"/>
+            <w:tcBorders>
+              <w:top w:val="single" w:color="BFBFBF" w:sz="4"/>
+              <w:bottom w:val="single" w:color="BFBFBF" w:sz="4"/>
+              <w:left w:val="single" w:color="BFBFBF" w:sz="4"/>
+              <w:right w:val="single" w:color="BFBFBF" w:sz="4"/>
+            </w:tcBorders>
+            <w:tcMar>
+              <w:top w:w="60" w:type="dxa"/>
+              <w:bottom w:w="60" w:type="dxa"/>
+              <w:start w:w="100" w:type="dxa"/>
+              <w:end w:w="100" w:type="dxa"/>
+            </w:tcMar>
+          </w:tcPr>
+          <w:p>
+            <w:pPr>
+              <w:spacing w:after="0"/>
+            </w:pPr>
+            <w:r>
+              <w:rPr>
+                <w:rFonts w:asciiTheme="majorHAnsi" w:hAnsiTheme="majorHAnsi" w:cstheme="majorHAnsi"/>
+                <w:b/>
+                <w:sz w:val="18"/>
+                <w:szCs w:val="18"/>
+              </w:rPr>
+              <w:t>Case Stage : </w:t>
+            </w:r>
+            <w:r>
+              <w:rPr>
+                <w:rFonts w:asciiTheme="majorHAnsi" w:hAnsiTheme="majorHAnsi" w:cstheme="majorHAnsi"/>
+                <w:sz w:val="18"/>
+                <w:szCs w:val="18"/>
+              </w:rPr>
+              <w:t xml:space="preserve">-</w:t>
+            </w:r>
+          </w:p>
+        </w:tc>
+      </w:tr>
+      <w:tr>
+        <w:tc>
+          <w:tcPr>
+            <w:tcW w:w="5074" w:type="dxa"/>
+            <w:tcBorders>
+              <w:top w:val="single" w:color="BFBFBF" w:sz="4"/>
+              <w:bottom w:val="single" w:color="BFBFBF" w:sz="4"/>
+              <w:left w:val="single" w:color="BFBFBF" w:sz="4"/>
+              <w:right w:val="single" w:color="BFBFBF" w:sz="4"/>
+            </w:tcBorders>
+            <w:tcMar>
+              <w:top w:w="60" w:type="dxa"/>
+              <w:bottom w:w="60" w:type="dxa"/>
+              <w:start w:w="100" w:type="dxa"/>
+              <w:end w:w="100" w:type="dxa"/>
+            </w:tcMar>
+          </w:tcPr>
+          <w:p>
+            <w:pPr>
+              <w:spacing w:after="0"/>
+            </w:pPr>
+            <w:r>
+              <w:rPr>
+                <w:rFonts w:asciiTheme="majorHAnsi" w:hAnsiTheme="majorHAnsi" w:cstheme="majorHAnsi"/>
+                <w:b/>
+                <w:sz w:val="18"/>
+                <w:szCs w:val="18"/>
+              </w:rPr>
+              <w:t>State : </w:t>
+            </w:r>
+            <w:r>
+              <w:rPr>
+                <w:rFonts w:asciiTheme="majorHAnsi" w:hAnsiTheme="majorHAnsi" w:cstheme="majorHAnsi"/>
+                <w:sz w:val="18"/>
+                <w:szCs w:val="18"/>
+              </w:rPr>
+              <w:t xml:space="preserve">-</w:t>
+            </w:r>
+          </w:p>
+        </w:tc>
+        <w:tc>
+          <w:tcPr>
+            <w:tcW w:w="5074" w:type="dxa"/>
+            <w:tcBorders>
+              <w:top w:val="single" w:color="BFBFBF" w:sz="4"/>
+              <w:bottom w:val="single" w:color="BFBFBF" w:sz="4"/>
+              <w:left w:val="single" w:color="BFBFBF" w:sz="4"/>
+              <w:right w:val="single" w:color="BFBFBF" w:sz="4"/>
+            </w:tcBorders>
+            <w:tcMar>
+              <w:top w:w="60" w:type="dxa"/>
+              <w:bottom w:w="60" w:type="dxa"/>
+              <w:start w:w="100" w:type="dxa"/>
+              <w:end w:w="100" w:type="dxa"/>
+            </w:tcMar>
+          </w:tcPr>
+          <w:p>
+            <w:pPr>
+              <w:spacing w:after="0"/>
+            </w:pPr>
+            <w:r>
+              <w:rPr>
+                <w:rFonts w:asciiTheme="majorHAnsi" w:hAnsiTheme="majorHAnsi" w:cstheme="majorHAnsi"/>
+                <w:b/>
+                <w:sz w:val="18"/>
+                <w:szCs w:val="18"/>
+              </w:rPr>
+              <w:t>District : </w:t>
+            </w:r>
+            <w:r>
+              <w:rPr>
+                <w:rFonts w:asciiTheme="majorHAnsi" w:hAnsiTheme="majorHAnsi" w:cstheme="majorHAnsi"/>
+                <w:sz w:val="18"/>
+                <w:szCs w:val="18"/>
+              </w:rPr>
+              <w:t xml:space="preserve">-</w:t>
+            </w:r>
+          </w:p>
+        </w:tc>
+      </w:tr>
+      <w:tr>
+        <w:tc>
+          <w:tcPr>
+            <w:tcW w:w="10148" w:type="dxa"/>
+            <w:tcBorders>
+              <w:top w:val="single" w:color="BFBFBF" w:sz="4"/>
+              <w:bottom w:val="single" w:color="BFBFBF" w:sz="4"/>
+              <w:left w:val="single" w:color="BFBFBF" w:sz="4"/>
+              <w:right w:val="single" w:color="BFBFBF" w:sz="4"/>
+            </w:tcBorders>
+            <w:tcMar>
+              <w:top w:w="60" w:type="dxa"/>
+              <w:bottom w:w="60" w:type="dxa"/>
+              <w:start w:w="100" w:type="dxa"/>
+              <w:end w:w="100" w:type="dxa"/>
+            </w:tcMar>
+            <w:gridSpan w:val="2"/>
+          </w:tcPr>
+          <w:p>
+            <w:pPr>
+              <w:spacing w:after="0"/>
+            </w:pPr>
+            <w:r>
+              <w:rPr>
+                <w:rFonts w:asciiTheme="majorHAnsi" w:hAnsiTheme="majorHAnsi" w:cstheme="majorHAnsi"/>
+                <w:b/>
+                <w:sz w:val="18"/>
+                <w:szCs w:val="18"/>
+              </w:rPr>
+              <w:t>Case Details : </w:t>
+            </w:r>
+            <w:r>
+              <w:rPr>
+                <w:rFonts w:asciiTheme="majorHAnsi" w:hAnsiTheme="majorHAnsi" w:cstheme="majorHAnsi"/>
+                <w:sz w:val="18"/>
+                <w:szCs w:val="18"/>
+              </w:rPr>
+              <w:t xml:space="preserve">No litigation cases on file.</w:t>
+            </w:r>
+          </w:p>
+        </w:tc>
+      </w:tr>
+      <w:tr>
+        <w:tc>
+          <w:tcPr>
+            <w:tcW w:w="5074" w:type="dxa"/>
+            <w:tcBorders>
+              <w:top w:val="single" w:color="BFBFBF" w:sz="4"/>
+              <w:bottom w:val="single" w:color="BFBFBF" w:sz="4"/>
+              <w:left w:val="single" w:color="BFBFBF" w:sz="4"/>
+              <w:right w:val="single" w:color="BFBFBF" w:sz="4"/>
+            </w:tcBorders>
+            <w:tcMar>
+              <w:top w:w="60" w:type="dxa"/>
+              <w:bottom w:w="60" w:type="dxa"/>
+              <w:start w:w="100" w:type="dxa"/>
+              <w:end w:w="100" w:type="dxa"/>
+            </w:tcMar>
+          </w:tcPr>
+          <w:p>
+            <w:pPr>
+              <w:spacing w:after="0"/>
+            </w:pPr>
+            <w:r>
+              <w:rPr>
+                <w:rFonts w:asciiTheme="majorHAnsi" w:hAnsiTheme="majorHAnsi" w:cstheme="majorHAnsi"/>
+                <w:b/>
+                <w:sz w:val="18"/>
+                <w:szCs w:val="18"/>
+              </w:rPr>
+              <w:t>LDOH : </w:t>
+            </w:r>
+            <w:r>
+              <w:rPr>
+                <w:rFonts w:asciiTheme="majorHAnsi" w:hAnsiTheme="majorHAnsi" w:cstheme="majorHAnsi"/>
+                <w:sz w:val="18"/>
+                <w:szCs w:val="18"/>
+              </w:rPr>
+              <w:t xml:space="preserve">-</w:t>
+            </w:r>
+          </w:p>
+        </w:tc>
+        <w:tc>
+          <w:tcPr>
+            <w:tcW w:w="5074" w:type="dxa"/>
+            <w:tcBorders>
+              <w:top w:val="single" w:color="BFBFBF" w:sz="4"/>
+              <w:bottom w:val="single" w:color="BFBFBF" w:sz="4"/>
+              <w:left w:val="single" w:color="BFBFBF" w:sz="4"/>
+              <w:right w:val="single" w:color="BFBFBF" w:sz="4"/>
+            </w:tcBorders>
+            <w:tcMar>
+              <w:top w:w="60" w:type="dxa"/>
+              <w:bottom w:w="60" w:type="dxa"/>
+              <w:start w:w="100" w:type="dxa"/>
+              <w:end w:w="100" w:type="dxa"/>
+            </w:tcMar>
+          </w:tcPr>
+          <w:p>
+            <w:pPr>
+              <w:spacing w:after="0"/>
+            </w:pPr>
+            <w:r>
+              <w:rPr>
+                <w:rFonts w:asciiTheme="majorHAnsi" w:hAnsiTheme="majorHAnsi" w:cstheme="majorHAnsi"/>
+                <w:b/>
+                <w:sz w:val="18"/>
+                <w:szCs w:val="18"/>
+              </w:rPr>
+              <w:t>NDOH : </w:t>
+            </w:r>
+            <w:r>
+              <w:rPr>
+                <w:rFonts w:asciiTheme="majorHAnsi" w:hAnsiTheme="majorHAnsi" w:cstheme="majorHAnsi"/>
+                <w:sz w:val="18"/>
+                <w:szCs w:val="18"/>
+              </w:rPr>
+              <w:t xml:space="preserve">-</w:t>
+            </w:r>
+          </w:p>
+        </w:tc>
+      </w:tr>
+      <w:tr>
+        <w:tc>
+          <w:tcPr>
+            <w:tcW w:w="10148" w:type="dxa"/>
+            <w:tcBorders>
+              <w:top w:val="single" w:color="BFBFBF" w:sz="4"/>
+              <w:bottom w:val="single" w:color="BFBFBF" w:sz="4"/>
+              <w:left w:val="single" w:color="BFBFBF" w:sz="4"/>
+              <w:right w:val="single" w:color="BFBFBF" w:sz="4"/>
+            </w:tcBorders>
+            <w:tcMar>
+              <w:top w:w="60" w:type="dxa"/>
+              <w:bottom w:w="60" w:type="dxa"/>
+              <w:start w:w="100" w:type="dxa"/>
+              <w:end w:w="100" w:type="dxa"/>
+            </w:tcMar>
+            <w:gridSpan w:val="2"/>
+          </w:tcPr>
+          <w:p>
+            <w:pPr>
+              <w:spacing w:after="0"/>
+            </w:pPr>
+            <w:r>
+              <w:rPr>
+                <w:rFonts w:asciiTheme="majorHAnsi" w:hAnsiTheme="majorHAnsi" w:cstheme="majorHAnsi"/>
+                <w:b/>
+                <w:sz w:val="18"/>
+                <w:szCs w:val="18"/>
+              </w:rPr>
+              <w:t>Status : </w:t>
+            </w:r>
+            <w:r>
+              <w:rPr>
+                <w:rFonts w:asciiTheme="majorHAnsi" w:hAnsiTheme="majorHAnsi" w:cstheme="majorHAnsi"/>
+                <w:sz w:val="18"/>
+                <w:szCs w:val="18"/>
+              </w:rPr>
+              <w:t xml:space="preserve">-</w:t>
+            </w:r>
           </w:p>
         </w:tc>
       </w:tr>
       <w:tr>
         <w:trPr>
-          <w:trHeight w:val="260"/>
+          <w:trHeight w:val="120"/>
         </w:trPr>
         <w:tc>
           <w:tcPr>
-            <w:tcW w:w="9834" w:type="dxa"/>
-            <w:tcMar>
-              <w:top w:w="40" w:type="dxa"/>
-              <w:left w:w="40" w:type="dxa"/>
-              <w:bottom w:w="40" w:type="dxa"/>
-              <w:right w:w="40" w:type="dxa"/>
-            </w:tcMar>
-          </w:tcPr>
-          <w:p>
-            <w:pPr>
-              <w:spacing w:after="0" w:line="240" w:lineRule="auto"/>
-              <w:rPr>
-                <w:rFonts w:asciiTheme="majorHAnsi" w:hAnsiTheme="majorHAnsi" w:cstheme="majorHAnsi"/>
-                <w:sz w:val="20"/>
-                <w:szCs w:val="20"/>
-              </w:rPr>
-            </w:pPr>
-          </w:p>
-        </w:tc>
-        <w:tc>
-          <w:tcPr>
-            <w:tcW w:w="630" w:type="dxa"/>
-            <w:tcMar>
-              <w:top w:w="40" w:type="dxa"/>
-              <w:left w:w="40" w:type="dxa"/>
-              <w:bottom w:w="40" w:type="dxa"/>
-              <w:right w:w="40" w:type="dxa"/>
-            </w:tcMar>
-          </w:tcPr>
-          <w:p>
-            <w:pPr>
-              <w:spacing w:after="0" w:line="240" w:lineRule="auto"/>
-              <w:rPr>
-                <w:rFonts w:asciiTheme="majorHAnsi" w:hAnsiTheme="majorHAnsi" w:cstheme="majorHAnsi"/>
-                <w:sz w:val="20"/>
-                <w:szCs w:val="20"/>
-              </w:rPr>
-            </w:pPr>
-          </w:p>
-        </w:tc>
-      </w:tr>
-      <w:tr>
-        <w:trPr>
-          <w:trHeight w:val="260"/>
-        </w:trPr>
-        <w:tc>
-          <w:tcPr>
-            <w:tcW w:w="9834" w:type="dxa"/>
-            <w:tcMar>
-              <w:top w:w="40" w:type="dxa"/>
-              <w:left w:w="40" w:type="dxa"/>
-              <w:bottom w:w="40" w:type="dxa"/>
-              <w:right w:w="40" w:type="dxa"/>
-            </w:tcMar>
-          </w:tcPr>
-          <w:p>
-            <w:pPr>
-              <w:spacing w:after="0" w:line="240" w:lineRule="auto"/>
-              <w:rPr>
-                <w:rFonts w:asciiTheme="majorHAnsi" w:hAnsiTheme="majorHAnsi" w:cstheme="majorHAnsi"/>
-                <w:sz w:val="20"/>
-                <w:szCs w:val="20"/>
-              </w:rPr>
-            </w:pPr>
-          </w:p>
-        </w:tc>
-        <w:tc>
-          <w:tcPr>
-            <w:tcW w:w="630" w:type="dxa"/>
-            <w:tcMar>
-              <w:top w:w="40" w:type="dxa"/>
-              <w:left w:w="40" w:type="dxa"/>
-              <w:bottom w:w="40" w:type="dxa"/>
-              <w:right w:w="40" w:type="dxa"/>
-            </w:tcMar>
-          </w:tcPr>
-          <w:p>
-            <w:pPr>
-              <w:spacing w:after="0" w:line="240" w:lineRule="auto"/>
-              <w:rPr>
-                <w:rFonts w:asciiTheme="majorHAnsi" w:hAnsiTheme="majorHAnsi" w:cstheme="majorHAnsi"/>
-                <w:sz w:val="20"/>
-                <w:szCs w:val="20"/>
-              </w:rPr>
-            </w:pPr>
-          </w:p>
-        </w:tc>
-      </w:tr>
-      <w:tr>
-        <w:trPr>
-          <w:trHeight w:val="260"/>
-        </w:trPr>
-        <w:tc>
-          <w:tcPr>
-            <w:tcW w:w="9834" w:type="dxa"/>
-            <w:tcMar>
-              <w:top w:w="40" w:type="dxa"/>
-              <w:left w:w="40" w:type="dxa"/>
-              <w:bottom w:w="40" w:type="dxa"/>
-              <w:right w:w="40" w:type="dxa"/>
-            </w:tcMar>
-          </w:tcPr>
-          <w:p>
-            <w:pPr>
-              <w:spacing w:after="0" w:line="240" w:lineRule="auto"/>
-              <w:rPr>
-                <w:rFonts w:asciiTheme="majorHAnsi" w:hAnsiTheme="majorHAnsi" w:cstheme="majorHAnsi"/>
-                <w:sz w:val="20"/>
-                <w:szCs w:val="20"/>
-              </w:rPr>
-            </w:pPr>
-          </w:p>
-        </w:tc>
-        <w:tc>
-          <w:tcPr>
-            <w:tcW w:w="630" w:type="dxa"/>
-            <w:tcMar>
-              <w:top w:w="40" w:type="dxa"/>
-              <w:left w:w="40" w:type="dxa"/>
-              <w:bottom w:w="40" w:type="dxa"/>
-              <w:right w:w="40" w:type="dxa"/>
-            </w:tcMar>
-          </w:tcPr>
-          <w:p>
-            <w:pPr>
-              <w:spacing w:after="0" w:line="240" w:lineRule="auto"/>
-              <w:rPr>
-                <w:rFonts w:asciiTheme="majorHAnsi" w:hAnsiTheme="majorHAnsi" w:cstheme="majorHAnsi"/>
-                <w:sz w:val="20"/>
-                <w:szCs w:val="20"/>
-              </w:rPr>
-            </w:pPr>
-          </w:p>
-        </w:tc>
-      </w:tr>
-      <w:tr>
-        <w:trPr>
-          <w:trHeight w:val="260"/>
-        </w:trPr>
-        <w:tc>
-          <w:tcPr>
-            <w:tcW w:w="9834" w:type="dxa"/>
-            <w:tcMar>
-              <w:top w:w="40" w:type="dxa"/>
-              <w:left w:w="40" w:type="dxa"/>
-              <w:bottom w:w="40" w:type="dxa"/>
-              <w:right w:w="40" w:type="dxa"/>
-            </w:tcMar>
-          </w:tcPr>
-          <w:p>
-            <w:pPr>
-              <w:spacing w:after="0" w:line="240" w:lineRule="auto"/>
-              <w:rPr>
-                <w:rFonts w:asciiTheme="majorHAnsi" w:hAnsiTheme="majorHAnsi" w:cstheme="majorHAnsi"/>
-                <w:sz w:val="20"/>
-                <w:szCs w:val="20"/>
-              </w:rPr>
-            </w:pPr>
-          </w:p>
-        </w:tc>
-        <w:tc>
-          <w:tcPr>
-            <w:tcW w:w="630" w:type="dxa"/>
-            <w:tcMar>
-              <w:top w:w="40" w:type="dxa"/>
-              <w:left w:w="40" w:type="dxa"/>
-              <w:bottom w:w="40" w:type="dxa"/>
-              <w:right w:w="40" w:type="dxa"/>
-            </w:tcMar>
-          </w:tcPr>
-          <w:p>
-            <w:pPr>
-              <w:spacing w:after="0" w:line="240" w:lineRule="auto"/>
-              <w:rPr>
-                <w:rFonts w:asciiTheme="majorHAnsi" w:hAnsiTheme="majorHAnsi" w:cstheme="majorHAnsi"/>
-                <w:sz w:val="20"/>
-                <w:szCs w:val="20"/>
-              </w:rPr>
-            </w:pPr>
-          </w:p>
-        </w:tc>
-      </w:tr>
-      <w:tr>
-        <w:trPr>
-          <w:trHeight w:val="260"/>
-        </w:trPr>
-        <w:tc>
-          <w:tcPr>
-            <w:tcW w:w="9834" w:type="dxa"/>
-            <w:tcMar>
-              <w:top w:w="40" w:type="dxa"/>
-              <w:left w:w="40" w:type="dxa"/>
-              <w:bottom w:w="40" w:type="dxa"/>
-              <w:right w:w="40" w:type="dxa"/>
-            </w:tcMar>
-          </w:tcPr>
-          <w:p>
-            <w:pPr>
-              <w:spacing w:after="0" w:line="240" w:lineRule="auto"/>
-              <w:rPr>
-                <w:rFonts w:asciiTheme="majorHAnsi" w:hAnsiTheme="majorHAnsi" w:cstheme="majorHAnsi"/>
-                <w:sz w:val="20"/>
-                <w:szCs w:val="20"/>
-              </w:rPr>
-            </w:pPr>
-          </w:p>
-        </w:tc>
-        <w:tc>
-          <w:tcPr>
-            <w:tcW w:w="630" w:type="dxa"/>
-            <w:tcMar>
-              <w:top w:w="40" w:type="dxa"/>
-              <w:left w:w="40" w:type="dxa"/>
-              <w:bottom w:w="40" w:type="dxa"/>
-              <w:right w:w="40" w:type="dxa"/>
-            </w:tcMar>
-          </w:tcPr>
-          <w:p>
-            <w:pPr>
-              <w:spacing w:after="0" w:line="240" w:lineRule="auto"/>
-              <w:rPr>
-                <w:rFonts w:asciiTheme="majorHAnsi" w:hAnsiTheme="majorHAnsi" w:cstheme="majorHAnsi"/>
-                <w:sz w:val="20"/>
-                <w:szCs w:val="20"/>
-              </w:rPr>
-            </w:pPr>
-          </w:p>
-        </w:tc>
-      </w:tr>
-      <w:tr>
-        <w:trPr>
-          <w:trHeight w:val="260"/>
-        </w:trPr>
-        <w:tc>
-          <w:tcPr>
-            <w:tcW w:w="9834" w:type="dxa"/>
-            <w:tcMar>
-              <w:top w:w="40" w:type="dxa"/>
-              <w:left w:w="40" w:type="dxa"/>
-              <w:bottom w:w="40" w:type="dxa"/>
-              <w:right w:w="40" w:type="dxa"/>
-            </w:tcMar>
-          </w:tcPr>
-          <w:p>
-            <w:pPr>
-              <w:spacing w:after="0" w:line="240" w:lineRule="auto"/>
-              <w:rPr>
-                <w:rFonts w:asciiTheme="majorHAnsi" w:hAnsiTheme="majorHAnsi" w:cstheme="majorHAnsi"/>
-                <w:sz w:val="20"/>
-                <w:szCs w:val="20"/>
-              </w:rPr>
-            </w:pPr>
-          </w:p>
-        </w:tc>
-        <w:tc>
-          <w:tcPr>
-            <w:tcW w:w="630" w:type="dxa"/>
-            <w:tcMar>
-              <w:top w:w="40" w:type="dxa"/>
-              <w:left w:w="40" w:type="dxa"/>
-              <w:bottom w:w="40" w:type="dxa"/>
-              <w:right w:w="40" w:type="dxa"/>
-            </w:tcMar>
-          </w:tcPr>
-          <w:p>
-            <w:pPr>
-              <w:spacing w:after="0" w:line="240" w:lineRule="auto"/>
-              <w:rPr>
-                <w:rFonts w:asciiTheme="majorHAnsi" w:hAnsiTheme="majorHAnsi" w:cstheme="majorHAnsi"/>
-                <w:sz w:val="20"/>
-                <w:szCs w:val="20"/>
-              </w:rPr>
-            </w:pPr>
-          </w:p>
-        </w:tc>
-      </w:tr>
-      <w:tr>
-        <w:trPr>
-          <w:trHeight w:val="260"/>
-        </w:trPr>
-        <w:tc>
-          <w:tcPr>
-            <w:tcW w:w="9834" w:type="dxa"/>
-            <w:tcMar>
-              <w:top w:w="40" w:type="dxa"/>
-              <w:left w:w="40" w:type="dxa"/>
-              <w:bottom w:w="40" w:type="dxa"/>
-              <w:right w:w="40" w:type="dxa"/>
-            </w:tcMar>
-          </w:tcPr>
-          <w:p>
-            <w:pPr>
-              <w:spacing w:after="0" w:line="240" w:lineRule="auto"/>
-              <w:rPr>
-                <w:rFonts w:asciiTheme="majorHAnsi" w:hAnsiTheme="majorHAnsi" w:cstheme="majorHAnsi"/>
-                <w:sz w:val="20"/>
-                <w:szCs w:val="20"/>
-              </w:rPr>
-            </w:pPr>
-          </w:p>
-        </w:tc>
-        <w:tc>
-          <w:tcPr>
-            <w:tcW w:w="630" w:type="dxa"/>
-            <w:tcMar>
-              <w:top w:w="40" w:type="dxa"/>
-              <w:left w:w="40" w:type="dxa"/>
-              <w:bottom w:w="40" w:type="dxa"/>
-              <w:right w:w="40" w:type="dxa"/>
-            </w:tcMar>
-          </w:tcPr>
-          <w:p>
-            <w:pPr>
-              <w:spacing w:after="0" w:line="240" w:lineRule="auto"/>
-              <w:rPr>
-                <w:rFonts w:asciiTheme="majorHAnsi" w:hAnsiTheme="majorHAnsi" w:cstheme="majorHAnsi"/>
-                <w:sz w:val="20"/>
-                <w:szCs w:val="20"/>
-              </w:rPr>
-            </w:pPr>
-          </w:p>
-        </w:tc>
-      </w:tr>
-      <w:tr>
-        <w:trPr>
-          <w:trHeight w:val="260"/>
-        </w:trPr>
-        <w:tc>
-          <w:tcPr>
-            <w:tcW w:w="9834" w:type="dxa"/>
-            <w:tcMar>
-              <w:top w:w="40" w:type="dxa"/>
-              <w:left w:w="40" w:type="dxa"/>
-              <w:bottom w:w="40" w:type="dxa"/>
-              <w:right w:w="40" w:type="dxa"/>
-            </w:tcMar>
-          </w:tcPr>
-          <w:p>
-            <w:pPr>
-              <w:spacing w:after="0" w:line="240" w:lineRule="auto"/>
-              <w:rPr>
-                <w:rFonts w:asciiTheme="majorHAnsi" w:hAnsiTheme="majorHAnsi" w:cstheme="majorHAnsi"/>
-                <w:sz w:val="20"/>
-                <w:szCs w:val="20"/>
-              </w:rPr>
-            </w:pPr>
-          </w:p>
-        </w:tc>
-        <w:tc>
-          <w:tcPr>
-            <w:tcW w:w="630" w:type="dxa"/>
-            <w:tcMar>
-              <w:top w:w="40" w:type="dxa"/>
-              <w:left w:w="40" w:type="dxa"/>
-              <w:bottom w:w="40" w:type="dxa"/>
-              <w:right w:w="40" w:type="dxa"/>
-            </w:tcMar>
-          </w:tcPr>
-          <w:p>
-            <w:pPr>
-              <w:spacing w:after="0" w:line="240" w:lineRule="auto"/>
-              <w:rPr>
-                <w:rFonts w:asciiTheme="majorHAnsi" w:hAnsiTheme="majorHAnsi" w:cstheme="majorHAnsi"/>
-                <w:sz w:val="20"/>
-                <w:szCs w:val="20"/>
-              </w:rPr>
-            </w:pPr>
-          </w:p>
-        </w:tc>
-      </w:tr>
-      <w:tr>
-        <w:trPr>
-          <w:trHeight w:val="260"/>
-        </w:trPr>
-        <w:tc>
-          <w:tcPr>
-            <w:tcW w:w="9834" w:type="dxa"/>
-            <w:tcMar>
-              <w:top w:w="40" w:type="dxa"/>
-              <w:left w:w="40" w:type="dxa"/>
-              <w:bottom w:w="40" w:type="dxa"/>
-              <w:right w:w="40" w:type="dxa"/>
-            </w:tcMar>
-          </w:tcPr>
-          <w:p>
-            <w:pPr>
-              <w:spacing w:after="0" w:line="240" w:lineRule="auto"/>
-              <w:rPr>
-                <w:rFonts w:asciiTheme="majorHAnsi" w:hAnsiTheme="majorHAnsi" w:cstheme="majorHAnsi"/>
-                <w:sz w:val="20"/>
-                <w:szCs w:val="20"/>
-              </w:rPr>
-            </w:pPr>
-          </w:p>
-        </w:tc>
-        <w:tc>
-          <w:tcPr>
-            <w:tcW w:w="630" w:type="dxa"/>
-            <w:tcMar>
-              <w:top w:w="40" w:type="dxa"/>
-              <w:left w:w="40" w:type="dxa"/>
-              <w:bottom w:w="40" w:type="dxa"/>
-              <w:right w:w="40" w:type="dxa"/>
-            </w:tcMar>
-          </w:tcPr>
-          <w:p>
-            <w:pPr>
-              <w:spacing w:after="0" w:line="240" w:lineRule="auto"/>
-              <w:rPr>
-                <w:rFonts w:asciiTheme="majorHAnsi" w:hAnsiTheme="majorHAnsi" w:cstheme="majorHAnsi"/>
-                <w:sz w:val="20"/>
-                <w:szCs w:val="20"/>
-              </w:rPr>
-            </w:pPr>
-          </w:p>
-        </w:tc>
-      </w:tr>
-      <w:tr>
-        <w:trPr>
-          <w:trHeight w:val="308"/>
-        </w:trPr>
-        <w:tc>
-          <w:tcPr>
-            <w:tcW w:w="9834" w:type="dxa"/>
-            <w:tcBorders>
-              <w:bottom w:val="single" w:color="000000" w:sz="8" w:space="0"/>
-            </w:tcBorders>
-            <w:tcMar>
-              <w:top w:w="40" w:type="dxa"/>
-              <w:left w:w="40" w:type="dxa"/>
-              <w:bottom w:w="40" w:type="dxa"/>
-              <w:right w:w="40" w:type="dxa"/>
-            </w:tcMar>
-          </w:tcPr>
-          <w:p>
-            <w:pPr>
-              <w:spacing w:after="0" w:line="240" w:lineRule="auto"/>
-              <w:rPr>
-                <w:rFonts w:asciiTheme="majorHAnsi" w:hAnsiTheme="majorHAnsi" w:cstheme="majorHAnsi"/>
-                <w:sz w:val="20"/>
-                <w:szCs w:val="20"/>
-              </w:rPr>
-            </w:pPr>
-          </w:p>
-        </w:tc>
-        <w:tc>
-          <w:tcPr>
-            <w:tcW w:w="630" w:type="dxa"/>
-            <w:tcBorders>
-              <w:bottom w:val="single" w:color="000000" w:sz="8" w:space="0"/>
-            </w:tcBorders>
-            <w:tcMar>
-              <w:top w:w="40" w:type="dxa"/>
-              <w:left w:w="40" w:type="dxa"/>
-              <w:bottom w:w="40" w:type="dxa"/>
-              <w:right w:w="40" w:type="dxa"/>
-            </w:tcMar>
-          </w:tcPr>
-          <w:p>
-            <w:pPr>
-              <w:spacing w:after="0" w:line="240" w:lineRule="auto"/>
-              <w:rPr>
-                <w:rFonts w:asciiTheme="majorHAnsi" w:hAnsiTheme="majorHAnsi" w:cstheme="majorHAnsi"/>
-                <w:sz w:val="20"/>
-                <w:szCs w:val="20"/>
-              </w:rPr>
-            </w:pPr>
-          </w:p>
+            <w:tcW w:w="10148" w:type="dxa"/>
+            <w:gridSpan w:val="2"/>
+          </w:tcPr>
+          <w:p/>
         </w:tc>
       </w:tr>
     </w:tbl>
@@ -4499,7 +4540,8 @@
     </w:p>
     <w:p>
       <w:pPr>
-        <w:spacing w:after="64"/>
+        <w:pageBreakBefore/>
+        <w:spacing w:before="600" w:after="64"/>
         <w:rPr>
           <w:rFonts w:ascii="Verdana" w:hAnsi="Verdana"/>
           <w:b/>
@@ -4775,8 +4817,8 @@
                 <wp:positionH relativeFrom="column">
                   <wp:posOffset>158115</wp:posOffset>
                 </wp:positionH>
-                <wp:positionV relativeFrom="paragraph">
-                  <wp:posOffset>6221095</wp:posOffset>
+                <wp:positionV relativeFrom="page">
+                  <wp:posOffset>5850000</wp:posOffset>
                 </wp:positionV>
                 <wp:extent cx="3150235" cy="1257300"/>
                 <wp:effectExtent l="0" t="0" r="0" b="0"/>
@@ -4883,7 +4925,7 @@
                 <v:stroke joinstyle="miter"/>
                 <v:path gradientshapeok="t" o:connecttype="rect"/>
               </v:shapetype>
-              <v:shape id="Text Box 2" style="position:absolute;left:0;text-align:left;margin-left:12.45pt;margin-top:489.85pt;width:248.05pt;height:99pt;z-index:251662336;visibility:visible;mso-wrap-style:square;mso-width-percent:0;mso-height-percent:0;mso-wrap-distance-left:9pt;mso-wrap-distance-top:3.6pt;mso-wrap-distance-right:9pt;mso-wrap-distance-bottom:3.6pt;mso-position-horizontal:absolute;mso-position-horizontal-relative:text;mso-position-vertical:absolute;mso-position-vertical-relative:text;mso-width-percent:0;mso-height-percent:0;mso-width-relative:margin;mso-height-relative:margin;v-text-anchor:top" o:spid="_x0000_s1026" stroked="f" type="#_x0000_t202" o:gfxdata="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">
+              <v:shape id="Text Box 2" style="position:absolute;left:0;text-align:left;margin-left:12.45pt;margin-top:460.63pt;width:248.05pt;height:99pt;z-index:251662336;visibility:visible;mso-wrap-style:square;mso-width-percent:0;mso-height-percent:0;mso-wrap-distance-left:9pt;mso-wrap-distance-top:3.6pt;mso-wrap-distance-right:9pt;mso-wrap-distance-bottom:3.6pt;mso-position-horizontal:absolute;mso-position-horizontal-relative:text;mso-position-vertical:absolute;mso-position-vertical-relative:page;mso-width-percent:0;mso-height-percent:0;mso-width-relative:margin;mso-height-relative:margin;v-text-anchor:top" o:spid="_x0000_s1026" stroked="f" type="#_x0000_t202" o:gfxdata="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">
                 <v:textbox>
                   <w:txbxContent>
                     <w:p>

</xml_diff>